<commit_message>
docs(tcc): inclui a interface grafica no cronograma de TCC2
A interface grafica desktop estava prevista como atividade futura no
TCC I e ficara de fora do plano. Outubro passa a ser dedicado a ela, em
cinco semanas: prototipacao e edicao assistida dos arquivos de
configuracao, montagem do comando e acompanhamento da execucao, testes e
empacotamento, e a documentacao das telas e decisoes de projeto no
relatorio.

O levantamento de requisitos entra na quarta semana de setembro, junto
com a revisao da Proposta de Solucao; os pre-textuais, o artigo SBC e os
apendices passam para a quinta semana de outubro. Novembro e dezembro
seguem inalterados, com os prazos de 10/11, 15/11, 16/11 a 04/12 e 10/12.

Co-Authored-By: Claude Opus 5 <noreply@anthropic.com>
</commit_message>
<xml_diff>
--- a/docs-tcc/ratificacao/RatificacaoTCC2_LucasBuenoCesario_2026-08.docx
+++ b/docs-tcc/ratificacao/RatificacaoTCC2_LucasBuenoCesario_2026-08.docx
@@ -1344,7 +1344,7 @@
               <w:bottom w:val="single" w:color="000000" w:sz="1"/>
               <w:right w:val="single" w:color="000000" w:sz="1"/>
             </w:tcBorders>
-            <w:shd w:fill="FCE4D6" w:val="clear" w:color="auto"/>
+            <w:shd w:fill="FFF2CC" w:val="clear" w:color="auto"/>
             <w:tcMar>
               <w:top w:type="dxa" w:w="60"/>
               <w:left w:type="dxa" w:w="100"/>
@@ -1367,7 +1367,7 @@
                 <w:sz w:val="20"/>
                 <w:szCs w:val="20"/>
               </w:rPr>
-              <w:t xml:space="preserve">Revisão do capítulo de Proposta de Solução: modelos de execução e estratégias de escrita</w:t>
+              <w:t xml:space="preserve">Revisão do capítulo de Proposta de Solução e levantamento de requisitos da interface gráfica desktop</w:t>
             </w:r>
           </w:p>
         </w:tc>
@@ -1380,7 +1380,7 @@
               <w:bottom w:val="single" w:color="000000" w:sz="1"/>
               <w:right w:val="single" w:color="000000" w:sz="1"/>
             </w:tcBorders>
-            <w:shd w:fill="FCE4D6" w:val="clear" w:color="auto"/>
+            <w:shd w:fill="FFF2CC" w:val="clear" w:color="auto"/>
             <w:tcMar>
               <w:top w:type="dxa" w:w="60"/>
               <w:left w:type="dxa" w:w="100"/>
@@ -1403,7 +1403,7 @@
                 <w:sz w:val="20"/>
                 <w:szCs w:val="20"/>
               </w:rPr>
-              <w:t xml:space="preserve">Relatório</w:t>
+              <w:t xml:space="preserve">Ambos</w:t>
             </w:r>
           </w:p>
         </w:tc>
@@ -1515,7 +1515,7 @@
                 <w:sz w:val="20"/>
                 <w:szCs w:val="20"/>
               </w:rPr>
-              <w:t xml:space="preserve">Automação dos testes de integração contra os cinco SGBDs em docker compose, em fluxo de integração contínua</w:t>
+              <w:t xml:space="preserve">Interface gráfica: prototipação das telas e edição assistida e validação dos dois arquivos JSON de configuração</w:t>
             </w:r>
           </w:p>
         </w:tc>
@@ -1616,7 +1616,7 @@
               <w:bottom w:val="single" w:color="000000" w:sz="1"/>
               <w:right w:val="single" w:color="000000" w:sz="1"/>
             </w:tcBorders>
-            <w:shd w:fill="FFF2CC" w:val="clear" w:color="auto"/>
+            <w:shd w:fill="E2EFDA" w:val="clear" w:color="auto"/>
             <w:tcMar>
               <w:top w:type="dxa" w:w="60"/>
               <w:left w:type="dxa" w:w="100"/>
@@ -1639,7 +1639,7 @@
                 <w:sz w:val="20"/>
                 <w:szCs w:val="20"/>
               </w:rPr>
-              <w:t xml:space="preserve">Ajustes finais da ferramenta e documentação do repositório: instruções de uso e de reprodução dos experimentos</w:t>
+              <w:t xml:space="preserve">Interface gráfica: montagem do comando de importação, execução e acompanhamento do progresso e das métricas</w:t>
             </w:r>
           </w:p>
         </w:tc>
@@ -1652,7 +1652,7 @@
               <w:bottom w:val="single" w:color="000000" w:sz="1"/>
               <w:right w:val="single" w:color="000000" w:sz="1"/>
             </w:tcBorders>
-            <w:shd w:fill="FFF2CC" w:val="clear" w:color="auto"/>
+            <w:shd w:fill="E2EFDA" w:val="clear" w:color="auto"/>
             <w:tcMar>
               <w:top w:type="dxa" w:w="60"/>
               <w:left w:type="dxa" w:w="100"/>
@@ -1675,7 +1675,7 @@
                 <w:sz w:val="20"/>
                 <w:szCs w:val="20"/>
               </w:rPr>
-              <w:t xml:space="preserve">Ambos</w:t>
+              <w:t xml:space="preserve">Ferramenta</w:t>
             </w:r>
           </w:p>
         </w:tc>
@@ -1740,7 +1740,7 @@
               <w:bottom w:val="single" w:color="000000" w:sz="1"/>
               <w:right w:val="single" w:color="000000" w:sz="1"/>
             </w:tcBorders>
-            <w:shd w:fill="FCE4D6" w:val="clear" w:color="auto"/>
+            <w:shd w:fill="E2EFDA" w:val="clear" w:color="auto"/>
             <w:tcMar>
               <w:top w:type="dxa" w:w="60"/>
               <w:left w:type="dxa" w:w="100"/>
@@ -1763,7 +1763,7 @@
                 <w:sz w:val="20"/>
                 <w:szCs w:val="20"/>
               </w:rPr>
-              <w:t xml:space="preserve">Reescrita do capítulo de Atividades Futuras, redação da Conclusão e elementos pré-textuais (resumo e abstract)</w:t>
+              <w:t xml:space="preserve">Testes e empacotamento da interface gráfica; automação dos testes de integração contra os cinco SGBDs em docker compose</w:t>
             </w:r>
           </w:p>
         </w:tc>
@@ -1776,7 +1776,7 @@
               <w:bottom w:val="single" w:color="000000" w:sz="1"/>
               <w:right w:val="single" w:color="000000" w:sz="1"/>
             </w:tcBorders>
-            <w:shd w:fill="FCE4D6" w:val="clear" w:color="auto"/>
+            <w:shd w:fill="E2EFDA" w:val="clear" w:color="auto"/>
             <w:tcMar>
               <w:top w:type="dxa" w:w="60"/>
               <w:left w:type="dxa" w:w="100"/>
@@ -1799,7 +1799,7 @@
                 <w:sz w:val="20"/>
                 <w:szCs w:val="20"/>
               </w:rPr>
-              <w:t xml:space="preserve">Relatório</w:t>
+              <w:t xml:space="preserve">Ferramenta</w:t>
             </w:r>
           </w:p>
         </w:tc>
@@ -1864,7 +1864,7 @@
               <w:bottom w:val="single" w:color="000000" w:sz="1"/>
               <w:right w:val="single" w:color="000000" w:sz="1"/>
             </w:tcBorders>
-            <w:shd w:fill="FCE4D6" w:val="clear" w:color="auto"/>
+            <w:shd w:fill="FFF2CC" w:val="clear" w:color="auto"/>
             <w:tcMar>
               <w:top w:type="dxa" w:w="60"/>
               <w:left w:type="dxa" w:w="100"/>
@@ -1887,7 +1887,7 @@
                 <w:sz w:val="20"/>
                 <w:szCs w:val="20"/>
               </w:rPr>
-              <w:t xml:space="preserve">Redação do artigo sobre o TCC no formato SBC e montagem dos apêndices: configurações, esquemas, artigo e acesso ao código-fonte</w:t>
+              <w:t xml:space="preserve">Documentação da interface gráfica no relatório (telas, fluxo de uso e decisões de projeto), reescrita das Atividades Futuras e redação da Conclusão</w:t>
             </w:r>
           </w:p>
         </w:tc>
@@ -1900,7 +1900,7 @@
               <w:bottom w:val="single" w:color="000000" w:sz="1"/>
               <w:right w:val="single" w:color="000000" w:sz="1"/>
             </w:tcBorders>
-            <w:shd w:fill="FCE4D6" w:val="clear" w:color="auto"/>
+            <w:shd w:fill="FFF2CC" w:val="clear" w:color="auto"/>
             <w:tcMar>
               <w:top w:type="dxa" w:w="60"/>
               <w:left w:type="dxa" w:w="100"/>
@@ -1923,7 +1923,7 @@
                 <w:sz w:val="20"/>
                 <w:szCs w:val="20"/>
               </w:rPr>
-              <w:t xml:space="preserve">Relatório</w:t>
+              <w:t xml:space="preserve">Ambos</w:t>
             </w:r>
           </w:p>
         </w:tc>
@@ -1934,6 +1934,130 @@
         </w:trPr>
         <w:tc>
           <w:tcPr>
+            <w:vMerge w:val="continue"/>
+            <w:tcBorders>
+              <w:top w:val="single" w:color="000000" w:sz="1"/>
+              <w:left w:val="single" w:color="000000" w:sz="1"/>
+              <w:bottom w:val="single" w:color="000000" w:sz="1"/>
+              <w:right w:val="single" w:color="000000" w:sz="1"/>
+            </w:tcBorders>
+          </w:tcPr>
+          <w:p/>
+        </w:tc>
+        <w:tc>
+          <w:tcPr>
+            <w:tcW w:type="dxa" w:w="1100"/>
+            <w:tcBorders>
+              <w:top w:val="single" w:color="000000" w:sz="1"/>
+              <w:left w:val="single" w:color="000000" w:sz="1"/>
+              <w:bottom w:val="single" w:color="000000" w:sz="1"/>
+              <w:right w:val="single" w:color="000000" w:sz="1"/>
+            </w:tcBorders>
+            <w:tcMar>
+              <w:top w:type="dxa" w:w="60"/>
+              <w:left w:type="dxa" w:w="100"/>
+              <w:bottom w:type="dxa" w:w="60"/>
+              <w:right w:type="dxa" w:w="100"/>
+            </w:tcMar>
+            <w:vAlign w:val="center"/>
+          </w:tcPr>
+          <w:p>
+            <w:pPr>
+              <w:jc w:val="center"/>
+            </w:pPr>
+            <w:r>
+              <w:rPr>
+                <w:rFonts w:ascii="Times New Roman" w:cs="Times New Roman" w:eastAsia="Times New Roman" w:hAnsi="Times New Roman"/>
+                <w:b w:val="false"/>
+                <w:bCs w:val="false"/>
+                <w:i w:val="false"/>
+                <w:iCs w:val="false"/>
+                <w:sz w:val="20"/>
+                <w:szCs w:val="20"/>
+              </w:rPr>
+              <w:t xml:space="preserve">5</w:t>
+            </w:r>
+          </w:p>
+        </w:tc>
+        <w:tc>
+          <w:tcPr>
+            <w:tcW w:type="dxa" w:w="3700"/>
+            <w:tcBorders>
+              <w:top w:val="single" w:color="000000" w:sz="1"/>
+              <w:left w:val="single" w:color="000000" w:sz="1"/>
+              <w:bottom w:val="single" w:color="000000" w:sz="1"/>
+              <w:right w:val="single" w:color="000000" w:sz="1"/>
+            </w:tcBorders>
+            <w:shd w:fill="FCE4D6" w:val="clear" w:color="auto"/>
+            <w:tcMar>
+              <w:top w:type="dxa" w:w="60"/>
+              <w:left w:type="dxa" w:w="100"/>
+              <w:bottom w:type="dxa" w:w="60"/>
+              <w:right w:type="dxa" w:w="100"/>
+            </w:tcMar>
+            <w:vAlign w:val="center"/>
+          </w:tcPr>
+          <w:p>
+            <w:pPr>
+              <w:jc w:val="left"/>
+            </w:pPr>
+            <w:r>
+              <w:rPr>
+                <w:rFonts w:ascii="Times New Roman" w:cs="Times New Roman" w:eastAsia="Times New Roman" w:hAnsi="Times New Roman"/>
+                <w:b w:val="false"/>
+                <w:bCs w:val="false"/>
+                <w:i w:val="false"/>
+                <w:iCs w:val="false"/>
+                <w:sz w:val="20"/>
+                <w:szCs w:val="20"/>
+              </w:rPr>
+              <w:t xml:space="preserve">Elementos pré-textuais (resumo e abstract), redação do artigo sobre o TCC no formato SBC e montagem dos apêndices</w:t>
+            </w:r>
+          </w:p>
+        </w:tc>
+        <w:tc>
+          <w:tcPr>
+            <w:tcW w:type="dxa" w:w="2726"/>
+            <w:tcBorders>
+              <w:top w:val="single" w:color="000000" w:sz="1"/>
+              <w:left w:val="single" w:color="000000" w:sz="1"/>
+              <w:bottom w:val="single" w:color="000000" w:sz="1"/>
+              <w:right w:val="single" w:color="000000" w:sz="1"/>
+            </w:tcBorders>
+            <w:shd w:fill="FCE4D6" w:val="clear" w:color="auto"/>
+            <w:tcMar>
+              <w:top w:type="dxa" w:w="60"/>
+              <w:left w:type="dxa" w:w="100"/>
+              <w:bottom w:type="dxa" w:w="60"/>
+              <w:right w:type="dxa" w:w="100"/>
+            </w:tcMar>
+            <w:vAlign w:val="center"/>
+          </w:tcPr>
+          <w:p>
+            <w:pPr>
+              <w:jc w:val="center"/>
+            </w:pPr>
+            <w:r>
+              <w:rPr>
+                <w:rFonts w:ascii="Times New Roman" w:cs="Times New Roman" w:eastAsia="Times New Roman" w:hAnsi="Times New Roman"/>
+                <w:b/>
+                <w:bCs/>
+                <w:i w:val="false"/>
+                <w:iCs w:val="false"/>
+                <w:sz w:val="20"/>
+                <w:szCs w:val="20"/>
+              </w:rPr>
+              <w:t xml:space="preserve">Relatório</w:t>
+            </w:r>
+          </w:p>
+        </w:tc>
+      </w:tr>
+      <w:tr>
+        <w:trPr>
+          <w:cantSplit/>
+        </w:trPr>
+        <w:tc>
+          <w:tcPr>
             <w:tcW w:type="dxa" w:w="1500"/>
             <w:vMerge w:val="restart"/>
             <w:tcBorders>
@@ -2035,7 +2159,7 @@
                 <w:sz w:val="20"/>
                 <w:szCs w:val="20"/>
               </w:rPr>
-              <w:t xml:space="preserve">Revisão geral do relatório com o orientador, revisão das referências bibliográficas e verificação das citações</w:t>
+              <w:t xml:space="preserve">Revisão geral do relatório e do artigo com o orientador, revisão das referências bibliográficas e verificação das citações</w:t>
             </w:r>
           </w:p>
         </w:tc>
@@ -2935,7 +3059,7 @@
           <w:sz w:val="24"/>
           <w:szCs w:val="24"/>
         </w:rPr>
-        <w:t>As atividades de agosto e setembro dão continuidade ao que foi acordado com o orientador para o recesso — a otimização do processamento com uso de memória limitado, a avaliação de desempenho da ferramenta e a redação dos capítulos correspondentes —, retomadas no início do semestre, em 10/08. O cronograma observa os prazos do semestre: 10/11 para a postagem da cópia do relatório, 15/11 para a confirmação da condição de o trabalho poder ser apresentado, de 16/11 a 04/12 para as apresentações e 10/12 para a postagem da versão final da monografia em PDF/A no Repositório Institucional da UFSC, tendo como apêndices o artigo sobre o TCC no formato SBC e o código-fonte, este último disponibilizado em repositório público com as orientações de acesso descritas no apêndice.</w:t>
+        <w:t>As atividades de agosto e setembro dão continuidade ao que foi acordado com o orientador para o recesso — a otimização do processamento com uso de memória limitado, a avaliação de desempenho da ferramenta e a redação dos capítulos correspondentes —, retomadas no início do semestre, em 10/08. Outubro é dedicado à interface gráfica desktop, prevista como atividade futura no TCC I, que monta o comando de importação de forma assistida e permite visualizar e editar os arquivos de configuração. O cronograma observa os prazos do semestre: 10/11 para a postagem da cópia do relatório, 15/11 para a confirmação da condição de o trabalho poder ser apresentado, de 16/11 a 04/12 para as apresentações e 10/12 para a postagem da versão final da monografia em PDF/A no Repositório Institucional da UFSC, tendo como apêndices o artigo sobre o TCC no formato SBC e o código-fonte, este último disponibilizado em repositório público com as orientações de acesso descritas no apêndice.</w:t>
       </w:r>
     </w:p>
     <w:p>

</xml_diff>